<commit_message>
wrap up 3 (#19)
</commit_message>
<xml_diff>
--- a/HW_assignments/Shared/SeniorDesign2TestPlan.docx
+++ b/HW_assignments/Shared/SeniorDesign2TestPlan.docx
@@ -594,23 +594,7 @@
         <w:t>PG1.5</w:t>
       </w:r>
       <w:r>
-        <w:t xml:space="preserve"> Outputs: A .</w:t>
-      </w:r>
-      <w:proofErr w:type="spellStart"/>
-      <w:r>
-        <w:t>py</w:t>
-      </w:r>
-      <w:proofErr w:type="spellEnd"/>
-      <w:r>
-        <w:t xml:space="preserve"> or .</w:t>
-      </w:r>
-      <w:proofErr w:type="spellStart"/>
-      <w:r>
-        <w:t>sql</w:t>
-      </w:r>
-      <w:proofErr w:type="spellEnd"/>
-      <w:r>
-        <w:t xml:space="preserve"> file with correct syntax. </w:t>
+        <w:t xml:space="preserve"> Outputs: A .py or .sql file with correct syntax. </w:t>
       </w:r>
     </w:p>
     <w:p>
@@ -1079,23 +1063,7 @@
           <w:rStyle w:val="HTMLCode"/>
           <w:rFonts w:eastAsiaTheme="majorEastAsia"/>
         </w:rPr>
-        <w:t>/generate-pipeline [</w:t>
-      </w:r>
-      <w:proofErr w:type="spellStart"/>
-      <w:r>
-        <w:rPr>
-          <w:rStyle w:val="HTMLCode"/>
-          <w:rFonts w:eastAsiaTheme="majorEastAsia"/>
-        </w:rPr>
-        <w:t>file_url</w:t>
-      </w:r>
-      <w:proofErr w:type="spellEnd"/>
-      <w:r>
-        <w:rPr>
-          <w:rStyle w:val="HTMLCode"/>
-          <w:rFonts w:eastAsiaTheme="majorEastAsia"/>
-        </w:rPr>
-        <w:t>]</w:t>
+        <w:t>/generate-pipeline [file_url]</w:t>
       </w:r>
       <w:r>
         <w:t xml:space="preserve">. </w:t>
@@ -2138,6 +2106,40 @@
         </w:tc>
       </w:tr>
     </w:tbl>
+    <w:p>
+      <w:pPr>
+        <w:pStyle w:val="Heading2"/>
+      </w:pPr>
+      <w:r>
+        <w:lastRenderedPageBreak/>
+        <w:t>Test Results</w:t>
+      </w:r>
+    </w:p>
+    <w:p>
+      <w:r>
+        <w:rPr>
+          <w:b/>
+          <w:bCs/>
+        </w:rPr>
+        <w:t>Test plan and execution.</w:t>
+      </w:r>
+      <w:r>
+        <w:t> Last semester we structured validation around three areas—schema inference, pipeline generation, and Slack integration—with the intent to test each slice on its own before exercising end-to-end flows. The plan called for a mix of black-box checks (does the observable output match what a user would expect?) and white-box reasoning (does the implementation handle edge cases and failures sensibly?). In practice we did not add an automated test suite (no unit or integration tests checked in and run in CI). Instead, validation was done by running the backend and bot locally or in a shared environment and walking through representative scenarios: for example, uploading CSVs to confirm inferred types in the returned JSON schema, including files where some columns were mostly null to see whether numeric columns were still inferred as numeric rather than collapsing to string, generating pipelines and inspecting the produced configuration or code for plausibility and errors, and exercising the Slack workflow by @-mentioning the bot and confirming threaded replies and basic error handling.</w:t>
+      </w:r>
+    </w:p>
+    <w:p/>
+    <w:p>
+      <w:r>
+        <w:rPr>
+          <w:b/>
+          <w:bCs/>
+        </w:rPr>
+        <w:t>Results.</w:t>
+      </w:r>
+      <w:r>
+        <w:t> All verification was therefore manual and exploratory rather than pass/fail against a frozen test harness. For the scenarios we exercised repeatedly during development—basic type inference, sparse or mostly-null columns, pipeline generation on sample inputs, and Slack request/response behavior—we did not uncover blocking defects that prevented demo-ready use, and issues we found were addressed iteratively as we developed. We acknowledge the limitation that results are not backed by reproducible automated runs; a natural next step for the project would be to codify the highest-value cases above as automated tests and to record explicit test case IDs, inputs, and expected outputs for regression checking.</w:t>
+      </w:r>
+    </w:p>
     <w:p/>
     <w:sectPr>
       <w:headerReference w:type="default" r:id="rId7"/>
@@ -2681,7 +2683,6 @@
     <w:next w:val="Normal"/>
     <w:link w:val="Heading2Char"/>
     <w:uiPriority w:val="9"/>
-    <w:semiHidden/>
     <w:unhideWhenUsed/>
     <w:qFormat/>
     <w:rsid w:val="00A348DC"/>
@@ -2872,7 +2873,6 @@
   <w:style w:type="character" w:default="1" w:styleId="DefaultParagraphFont">
     <w:name w:val="Default Paragraph Font"/>
     <w:uiPriority w:val="1"/>
-    <w:semiHidden/>
     <w:unhideWhenUsed/>
   </w:style>
   <w:style w:type="table" w:default="1" w:styleId="TableNormal">
@@ -2914,7 +2914,6 @@
     <w:basedOn w:val="DefaultParagraphFont"/>
     <w:link w:val="Heading2"/>
     <w:uiPriority w:val="9"/>
-    <w:semiHidden/>
     <w:rsid w:val="00A348DC"/>
     <w:rPr>
       <w:rFonts w:asciiTheme="majorHAnsi" w:eastAsiaTheme="majorEastAsia" w:hAnsiTheme="majorHAnsi" w:cstheme="majorBidi"/>

</xml_diff>